<commit_message>
PAUSED (task137): round 2 redesign, stage 3 green, waiting on the reader and judge
The 10/10 audit's redesign: the decisive step moves from the repricing drop to the class of the money
(what a new-money special won, which goes to the retention offer at its first maturity whatever its drop,
against member money, which goes with the drop). Book 5,250 agent-hours (1,250, 2,000, 2,000); the share
by drop books 4,250, the audit's locked-rate-by-term logit 4,500, every one of 22 rivals two bins or more
under. Ask A's link moved into the payments narrative, Ask B's overlap into hand-moved certificates with
capitalised interest; the prompt's ask wording rewritten.

Co-Authored-By: Claude Opus 5.5 <noreply@anthropic.com>
Claude-Session: https://claude.ai/code/session_01A6XcFx5t62c7gPi1bBKcVi
</commit_message>
<xml_diff>
--- a/task137/golden/td_booking_note_q1_2027.docx
+++ b/task137/golden/td_booking_note_q1_2027.docx
@@ -27,7 +27,7 @@
           <w:color w:val="173A5E"/>
           <w:sz w:val="28"/>
         </w:rPr>
-        <w:t>January to March 2027 maturity calls: book 5,500 agent-hours with Harbourline</w:t>
+        <w:t>January to March 2027 maturity calls: book 5,250 agent-hours with Harbourline</w:t>
       </w:r>
     </w:p>
     <w:p>
@@ -52,7 +52,7 @@
         <w:rPr>
           <w:b/>
         </w:rPr>
-        <w:t>Book 5,500 agent-hours with Harbourline for the January to March 2027 list: 1,500 for the deposits maturing in January, 2,000 for February and 2,000 for March.</w:t>
+        <w:t>Book 5,250 agent-hours with Harbourline for the January to March 2027 list: 1,250 for the deposits maturing in January, 2,000 for February and 2,000 for March.</w:t>
       </w:r>
       <w:r>
         <w:t xml:space="preserve"> The block is due with Harbourline on Friday 20 November; it is payable in full, and hours beyond it cost the block rate plus 35 per cent.</w:t>
@@ -134,7 +134,7 @@
           <w:b w:val="0"/>
           <w:i w:val="0"/>
         </w:rPr>
-        <w:t>10,735 of the 18,400 deposits on the list are four-year deposits opened at 5.65 per cent in January to March 2023. They reinvest at the 3.15 per cent four-year rate ALCO has approved for the quarter, a drop of 2.50 points. In every campaign since January 2025, whether a holder Harbourline reached said they meant to move the money, and so went through the 22-minute retention offer, followed the drop from the deposit's rate to the rate it rolled onto: 0.1 per cent of conversations where the rate rose, 92 per cent at drops of 2.5 points or more. The four-year deposits we have called so far were opened in 2021 and 2022, when rates were low, and few of their holders took the offer. On this list about 62 per cent of an expected 14,000 conversations should go to the retention offer, against 33 per cent across the seven campaigns.</w:t>
+        <w:t>10,697 of the 18,400 deposits on the list are 4-year deposits opened at the 5.65 per cent special in January to March 2023; the other 4-year deposits opened that quarter carry 5.15 per cent or a little more. Money a special brings in behaves differently at its first maturity: in the seven campaigns since January 2025, 87 per cent of the conversations Harbourline held about deposits opened at a special went to the 22-minute retention offer, much the same at every drop to the rate they rolled onto, and those about other deposits far less often. The special's deposits now meet a 1.65-point drop to the 4.00 per cent 4-year rate. At drops of 1.50 to 1.75 points past conversations about other deposits went to the offer 28 per cent of the time, and they were almost all the conversations at that drop; those about a special's money went at 88 per cent. On this list about 54 per cent of an expected 14,000 conversations should go to the retention offer, against 21 per cent across the seven campaigns.</w:t>
       </w:r>
     </w:p>
     <w:p>
@@ -160,7 +160,7 @@
           <w:b w:val="0"/>
           <w:i w:val="0"/>
         </w:rPr>
-        <w:t>Harbourline bills 1.5 minutes for each dial that does not reach the holder, 8 for each conversation and 22 for each retention-offer conversation. Dialling per case comes from the seven closed campaigns for each mix of callable numbers, after washing the list's numbers against the do-not-call register at the cut: 460 deposits have no callable number and will get the maturity letter only. 95.5 per cent of deposits with a callable number have reached release in past campaigns; the rest gave us instructions first.</w:t>
+        <w:t>Harbourline bills 1.5 minutes for each dial that does not reach the holder, 8 for each conversation and 22 for each retention-offer conversation. Dialling per case comes from the seven closed campaigns for each mix of callable numbers, after washing the list's numbers against the do-not-call register at the cut: 464 deposits have no callable number and will get the maturity letter only. 95.2 per cent of deposits with a callable number have reached release in past campaigns; the rest gave us instructions first.</w:t>
       </w:r>
     </w:p>
     <w:p>

</xml_diff>